<commit_message>
added zip file and framework given by akash
</commit_message>
<xml_diff>
--- a/Custom_DU_Template/ReadMe.docx
+++ b/Custom_DU_Template/ReadMe.docx
@@ -1,6 +1,6 @@
 
 <file path=word/document.xml><?xml version="1.0" encoding="utf-8"?>
-<w:document xmlns:wpc="http://schemas.microsoft.com/office/word/2010/wordprocessingCanvas" xmlns:cx="http://schemas.microsoft.com/office/drawing/2014/chartex" xmlns:cx1="http://schemas.microsoft.com/office/drawing/2015/9/8/chartex" xmlns:cx2="http://schemas.microsoft.com/office/drawing/2015/10/21/chartex" xmlns:cx3="http://schemas.microsoft.com/office/drawing/2016/5/9/chartex" xmlns:cx4="http://schemas.microsoft.com/office/drawing/2016/5/10/chartex" xmlns:cx5="http://schemas.microsoft.com/office/drawing/2016/5/11/chartex" xmlns:cx6="http://schemas.microsoft.com/office/drawing/2016/5/12/chartex" xmlns:cx7="http://schemas.microsoft.com/office/drawing/2016/5/13/chartex" xmlns:cx8="http://schemas.microsoft.com/office/drawing/2016/5/14/chartex" xmlns:mc="http://schemas.openxmlformats.org/markup-compatibility/2006" xmlns:aink="http://schemas.microsoft.com/office/drawing/2016/ink" xmlns:am3d="http://schemas.microsoft.com/office/drawing/2017/model3d" xmlns:o="urn:schemas-microsoft-com:office:office" xmlns:oel="http://schemas.microsoft.com/office/2019/extlst" xmlns:r="http://schemas.openxmlformats.org/officeDocument/2006/relationships" xmlns:m="http://schemas.openxmlformats.org/officeDocument/2006/math" xmlns:v="urn:schemas-microsoft-com:vml" xmlns:wp14="http://schemas.microsoft.com/office/word/2010/wordprocessingDrawing" xmlns:wp="http://schemas.openxmlformats.org/drawingml/2006/wordprocessingDrawing" xmlns:w10="urn:schemas-microsoft-com:office:word" xmlns:w="http://schemas.openxmlformats.org/wordprocessingml/2006/main" xmlns:w14="http://schemas.microsoft.com/office/word/2010/wordml" xmlns:w15="http://schemas.microsoft.com/office/word/2012/wordml" xmlns:w16cex="http://schemas.microsoft.com/office/word/2018/wordml/cex" xmlns:w16cid="http://schemas.microsoft.com/office/word/2016/wordml/cid" xmlns:w16="http://schemas.microsoft.com/office/word/2018/wordml" xmlns:w16du="http://schemas.microsoft.com/office/word/2023/wordml/word16du" xmlns:w16sdtdh="http://schemas.microsoft.com/office/word/2020/wordml/sdtdatahash" xmlns:w16sdtfl="http://schemas.microsoft.com/office/word/2024/wordml/sdtformatlock" xmlns:w16se="http://schemas.microsoft.com/office/word/2015/wordml/symex" xmlns:wpg="http://schemas.microsoft.com/office/word/2010/wordprocessingGroup" xmlns:wpi="http://schemas.microsoft.com/office/word/2010/wordprocessingInk" xmlns:wne="http://schemas.microsoft.com/office/word/2006/wordml" xmlns:wps="http://schemas.microsoft.com/office/word/2010/wordprocessingShape" mc:Ignorable="w14 w15 w16se w16cid w16 w16cex w16sdtdh w16sdtfl w16du wp14">
+<w:document xmlns:wpc="http://schemas.microsoft.com/office/word/2010/wordprocessingCanvas" xmlns:cx="http://schemas.microsoft.com/office/drawing/2014/chartex" xmlns:cx1="http://schemas.microsoft.com/office/drawing/2015/9/8/chartex" xmlns:cx2="http://schemas.microsoft.com/office/drawing/2015/10/21/chartex" xmlns:cx3="http://schemas.microsoft.com/office/drawing/2016/5/9/chartex" xmlns:cx4="http://schemas.microsoft.com/office/drawing/2016/5/10/chartex" xmlns:cx5="http://schemas.microsoft.com/office/drawing/2016/5/11/chartex" xmlns:cx6="http://schemas.microsoft.com/office/drawing/2016/5/12/chartex" xmlns:cx7="http://schemas.microsoft.com/office/drawing/2016/5/13/chartex" xmlns:cx8="http://schemas.microsoft.com/office/drawing/2016/5/14/chartex" xmlns:mc="http://schemas.openxmlformats.org/markup-compatibility/2006" xmlns:aink="http://schemas.microsoft.com/office/drawing/2016/ink" xmlns:am3d="http://schemas.microsoft.com/office/drawing/2017/model3d" xmlns:o="urn:schemas-microsoft-com:office:office" xmlns:oel="http://schemas.microsoft.com/office/2019/extlst" xmlns:r="http://schemas.openxmlformats.org/officeDocument/2006/relationships" xmlns:m="http://schemas.openxmlformats.org/officeDocument/2006/math" xmlns:v="urn:schemas-microsoft-com:vml" xmlns:wp14="http://schemas.microsoft.com/office/word/2010/wordprocessingDrawing" xmlns:wp="http://schemas.openxmlformats.org/drawingml/2006/wordprocessingDrawing" xmlns:w10="urn:schemas-microsoft-com:office:word" xmlns:w="http://schemas.openxmlformats.org/wordprocessingml/2006/main" xmlns:w14="http://schemas.microsoft.com/office/word/2010/wordml" xmlns:w15="http://schemas.microsoft.com/office/word/2012/wordml" xmlns:w16cei="http://schemas.microsoft.com/office/word/2026/wordml/cei" xmlns:w16cex="http://schemas.microsoft.com/office/word/2018/wordml/cex" xmlns:w16cid="http://schemas.microsoft.com/office/word/2016/wordml/cid" xmlns:w16="http://schemas.microsoft.com/office/word/2018/wordml" xmlns:w16du="http://schemas.microsoft.com/office/word/2023/wordml/word16du" xmlns:w16sdtdh="http://schemas.microsoft.com/office/word/2020/wordml/sdtdatahash" xmlns:w16sdtfl="http://schemas.microsoft.com/office/word/2024/wordml/sdtformatlock" xmlns:w16se="http://schemas.microsoft.com/office/word/2015/wordml/symex" xmlns:wpg="http://schemas.microsoft.com/office/word/2010/wordprocessingGroup" xmlns:wpi="http://schemas.microsoft.com/office/word/2010/wordprocessingInk" xmlns:wne="http://schemas.microsoft.com/office/word/2006/wordml" xmlns:wps="http://schemas.microsoft.com/office/word/2010/wordprocessingShape" mc:Ignorable="w14 w15 w16se w16cid w16 w16cex w16sdtdh w16sdtfl w16du wp14">
   <w:body>
     <w:p>
       <w:r>
@@ -9,6 +9,9 @@
     </w:p>
     <w:p>
       <w:r>
+        <w:rPr>
+          <w:noProof/>
+        </w:rPr>
         <w:drawing>
           <wp:inline distT="0" distB="0" distL="0" distR="0" wp14:anchorId="02EF873F" wp14:editId="3A243236">
             <wp:extent cx="14555461" cy="6538527"/>
@@ -50,6 +53,9 @@
     <w:p/>
     <w:p>
       <w:r>
+        <w:rPr>
+          <w:noProof/>
+        </w:rPr>
         <w:drawing>
           <wp:inline distT="0" distB="0" distL="0" distR="0" wp14:anchorId="04305291" wp14:editId="2496BBD2">
             <wp:extent cx="9712607" cy="3212123"/>
@@ -90,6 +96,9 @@
     <w:p/>
     <w:p>
       <w:r>
+        <w:rPr>
+          <w:noProof/>
+        </w:rPr>
         <w:drawing>
           <wp:inline distT="0" distB="0" distL="0" distR="0" wp14:anchorId="1E408B9B" wp14:editId="57E7049B">
             <wp:extent cx="10480297" cy="4806462"/>
@@ -128,7 +137,38 @@
       </w:r>
     </w:p>
     <w:p/>
+    <w:p>
+      <w:r>
+        <w:t xml:space="preserve">You can Also create these Assets and Other Items with </w:t>
+      </w:r>
+      <w:proofErr w:type="spellStart"/>
+      <w:r>
+        <w:t>InitializeOrchestrator.xaml</w:t>
+      </w:r>
+      <w:proofErr w:type="spellEnd"/>
+      <w:r>
+        <w:t xml:space="preserve"> from Quick Start Folder.</w:t>
+      </w:r>
+    </w:p>
+    <w:p>
+      <w:r>
+        <w:t xml:space="preserve">You might need to make changes in the .xlsx file first. And then run the </w:t>
+      </w:r>
+      <w:proofErr w:type="spellStart"/>
+      <w:r>
+        <w:t>xaml</w:t>
+      </w:r>
+      <w:proofErr w:type="spellEnd"/>
+      <w:r>
+        <w:t>.</w:t>
+      </w:r>
+    </w:p>
     <w:p/>
+    <w:p>
+      <w:r>
+        <w:t>I have created the Items Manually .</w:t>
+      </w:r>
+    </w:p>
     <w:p/>
     <w:p/>
     <w:p/>

</xml_diff>